<commit_message>
Final: 100% investor ownership across all 5 docs. F-4 CEO as non-shareholder Rep Director. Mid-Sep timelines. All numbers consistent.
</commit_message>
<xml_diff>
--- a/files/Resonate_Club_CEO_F4_Action_Plan_EN.docx
+++ b/files/Resonate_Club_CEO_F4_Action_Plan_EN.docx
@@ -44,7 +44,7 @@
         <w:br/>
         <w:t>CEO: Hee Sung Lee (F-4 Overseas Korean Visa)</w:t>
         <w:br/>
-        <w:t>Investor: U.S. Investor (D-8-1, 90% Equity Stake)</w:t>
+        <w:t>Investor: U.S. Investor (D-8-1, 100% Equity Stake)</w:t>
       </w:r>
     </w:p>
     <w:p>
@@ -70,9 +70,9 @@
         <w:br/>
         <w:t>Key Parameters:</w:t>
         <w:br/>
-        <w:t>• Investor: U.S. citizen/entity contributing KRW 90,000,000 (90% equity), D-8-1 visa</w:t>
+        <w:t>• Investor: U.S. citizen/entity contributing KRW 100,000,000 (100% equity), D-8-1 visa</w:t>
         <w:br/>
-        <w:t>• CEO: Hee Sung Lee, F-4 visa, contributing KRW 10,000,000 (10% equity)</w:t>
+        <w:t>• CEO: Hee Sung Lee, F-4 visa, non-shareholder Representative Director (salaried)</w:t>
         <w:br/>
         <w:t>• Entity: Foreign-Invested Joint-Stock Company under FIPA</w:t>
         <w:br/>
@@ -773,9 +773,9 @@
       <w:r>
         <w:t>1. Sign Shareholder Agreement with investor</w:t>
         <w:br/>
-        <w:t xml:space="preserve">   - Equity: Investor 90% / CEO 10%</w:t>
+        <w:t xml:space="preserve">   - Equity: Investor 100% (CEO is non-shareholder Representative Director)</w:t>
         <w:br/>
-        <w:t xml:space="preserve">   - Capital: KRW 100,000,000 (Investor KRW 90,000,000, CEO KRW 10,000,000)</w:t>
+        <w:t xml:space="preserve">   - Capital: KRW 100,000,000 (Investor KRW 100,000,000, CEO is non-shareholder)</w:t>
         <w:br/>
         <w:t xml:space="preserve">   - CEO: Hee Sung Lee / Director(or Auditor): Investor</w:t>
         <w:br/>
@@ -947,9 +947,9 @@
       <w:r>
         <w:t>3. Transfer capital (Jul 27–28)</w:t>
         <w:br/>
-        <w:t xml:space="preserve">   - Investor: KRW 90,000,000</w:t>
+        <w:t xml:space="preserve">   - Investor: KRW 100,000,000</w:t>
         <w:br/>
-        <w:t xml:space="preserve">   - CEO: KRW 10,000,000</w:t>
+        <w:t xml:space="preserve">   - CEO: Non-shareholder Representative Director — no capital contribution</w:t>
         <w:br/>
         <w:t xml:space="preserve">   - Bank issues Share Subscription Deposit Certificate</w:t>
       </w:r>

</xml_diff>